<commit_message>
update pract3 task2 (searchTextBox)
</commit_message>
<xml_diff>
--- a/CP/КП МДК.02.01 Горбунов 2026 (лист задания).docx
+++ b/CP/КП МДК.02.01 Горбунов 2026 (лист задания).docx
@@ -838,15 +838,7 @@
         <w:rPr>
           <w:u w:val="single"/>
         </w:rPr>
-        <w:t>возможность переписываться в лич</w:t>
-      </w:r>
-      <w:bookmarkStart w:id="0" w:name="_GoBack"/>
-      <w:bookmarkEnd w:id="0"/>
-      <w:r>
-        <w:rPr>
-          <w:u w:val="single"/>
-        </w:rPr>
-        <w:t>ных сообщениях</w:t>
+        <w:t>возможность переписываться в личных сообщениях</w:t>
       </w:r>
       <w:r>
         <w:rPr>
@@ -1633,7 +1625,16 @@
           <w:color w:val="000000"/>
           <w:u w:val="single"/>
         </w:rPr>
-        <w:t xml:space="preserve"> - защита курсового проекта</w:t>
+        <w:t xml:space="preserve"> –</w:t>
+      </w:r>
+      <w:bookmarkStart w:id="0" w:name="_GoBack"/>
+      <w:bookmarkEnd w:id="0"/>
+      <w:r>
+        <w:rPr>
+          <w:color w:val="000000"/>
+          <w:u w:val="single"/>
+        </w:rPr>
+        <w:t xml:space="preserve"> защита курсового проекта</w:t>
       </w:r>
       <w:r>
         <w:rPr>

</xml_diff>